<commit_message>
Course project outline: revise with proofreading/academic/stop-slop review; set student and supervisor
Co-Authored-By: Claude Opus 5.5 <noreply@anthropic.com>
Claude-Session: https://claude.ai/code/session_01DV1FpN7pyDPdia8AQncgwU
</commit_message>
<xml_diff>
--- a/ghi_chu_khac/De_an_mon_hoc_LTM/De_cuong_so_bo_De_an.docx
+++ b/ghi_chu_khac/De_an_mon_hoc_LTM/De_cuong_so_bo_De_an.docx
@@ -39,7 +39,7 @@
         <w:rPr>
           <w:b w:val="0"/>
         </w:rPr>
-        <w:t>Sinh viên: Phạm Thị Mỹ Bình</w:t>
+        <w:t>Sinh viên: Nguyễn Mai Tuyết Nhi</w:t>
       </w:r>
     </w:p>
     <w:p>
@@ -50,7 +50,7 @@
         <w:rPr>
           <w:b w:val="0"/>
         </w:rPr>
-        <w:t>Mã sinh viên: 19241399</w:t>
+        <w:t>Mã sinh viên: 19240283</w:t>
       </w:r>
     </w:p>
     <w:p>
@@ -61,7 +61,7 @@
         <w:rPr>
           <w:b w:val="0"/>
         </w:rPr>
-        <w:t>Lớp: LUKT36A</w:t>
+        <w:t>Lớp: LUKT34A</w:t>
       </w:r>
     </w:p>
     <w:p>
@@ -72,7 +72,7 @@
         <w:rPr>
           <w:b w:val="0"/>
         </w:rPr>
-        <w:t>Giảng viên hướng dẫn:</w:t>
+        <w:t>Giảng viên hướng dẫn: ThS. Lương Tuấn Sơn</w:t>
       </w:r>
     </w:p>
     <w:p>
@@ -118,7 +118,7 @@
         <w:rPr>
           <w:b w:val="0"/>
         </w:rPr>
-        <w:t>1. Lý do chọn đề tài</w:t>
+        <w:t>1. Lý do chọn đề tài và ý nghĩa của việc nghiên cứu</w:t>
       </w:r>
     </w:p>
     <w:p>
@@ -177,7 +177,7 @@
         <w:rPr>
           <w:b/>
         </w:rPr>
-        <w:t>CHƯƠNG 1. KHÁI QUÁT VÀ NỘI DUNG PHÁP LUẬT VỀ MUA CỔ PHẦN, PHẦN VỐN GÓP CỦA NHÀ ĐẦU TƯ NƯỚC NGOÀI</w:t>
+        <w:t>CHƯƠNG 1. NHỮNG VẤN ĐỀ LÝ LUẬN VÀ QUY ĐỊNH PHÁP LUẬT VỀ MUA CỔ PHẦN, PHẦN VỐN GÓP CỦA NHÀ ĐẦU TƯ NƯỚC NGOÀI</w:t>
       </w:r>
     </w:p>
     <w:p>
@@ -188,7 +188,7 @@
         <w:rPr>
           <w:b/>
         </w:rPr>
-        <w:t>1.1. Khái quát về mua cổ phần, phần vốn góp của nhà đầu tư nước ngoài</w:t>
+        <w:t>1.1. Những vấn đề lý luận về mua cổ phần, phần vốn góp của nhà đầu tư nước ngoài</w:t>
       </w:r>
     </w:p>
     <w:p>
@@ -200,7 +200,7 @@
         <w:rPr>
           <w:b w:val="0"/>
         </w:rPr>
-        <w:t>1.1.1. Khái niệm nhà đầu tư nước ngoài và mua cổ phần, phần vốn góp</w:t>
+        <w:t>1.1.1. Khái niệm nhà đầu tư nước ngoài</w:t>
       </w:r>
     </w:p>
     <w:p>
@@ -212,7 +212,7 @@
         <w:rPr>
           <w:b w:val="0"/>
         </w:rPr>
-        <w:t>1.1.2. Đặc điểm của hình thức đầu tư mua cổ phần, phần vốn góp</w:t>
+        <w:t>1.1.2. Khái niệm, đặc điểm của mua cổ phần, phần vốn góp</w:t>
       </w:r>
     </w:p>
     <w:p>
@@ -224,7 +224,7 @@
         <w:rPr>
           <w:b w:val="0"/>
         </w:rPr>
-        <w:t>1.1.3. Ý nghĩa đối với nhà đầu tư, doanh nghiệp và quản lý nhà nước</w:t>
+        <w:t>1.1.3. Vai trò của hình thức đầu tư mua cổ phần, phần vốn góp</w:t>
       </w:r>
     </w:p>
     <w:p>
@@ -235,7 +235,7 @@
         <w:rPr>
           <w:b/>
         </w:rPr>
-        <w:t>1.2. Nội dung pháp luật về mua cổ phần, phần vốn góp của nhà đầu tư nước ngoài</w:t>
+        <w:t>1.2. Quy định pháp luật về mua cổ phần, phần vốn góp của nhà đầu tư nước ngoài</w:t>
       </w:r>
     </w:p>
     <w:p>
@@ -247,7 +247,7 @@
         <w:rPr>
           <w:b w:val="0"/>
         </w:rPr>
-        <w:t>1.2.1. Hình thức mua cổ phần, phần vốn góp</w:t>
+        <w:t>1.2.1. Nguồn luật điều chỉnh</w:t>
       </w:r>
     </w:p>
     <w:p>
@@ -259,7 +259,19 @@
         <w:rPr>
           <w:b w:val="0"/>
         </w:rPr>
-        <w:t>1.2.2. Điều kiện đối với nhà đầu tư nước ngoài</w:t>
+        <w:t>1.2.2. Hình thức mua cổ phần, phần vốn góp</w:t>
+      </w:r>
+    </w:p>
+    <w:p>
+      <w:pPr>
+        <w:spacing w:after="60" w:line="312" w:lineRule="auto"/>
+        <w:ind w:left="850"/>
+      </w:pPr>
+      <w:r>
+        <w:rPr>
+          <w:b w:val="0"/>
+        </w:rPr>
+        <w:t>1.2.3. Điều kiện đối với nhà đầu tư nước ngoài</w:t>
       </w:r>
     </w:p>
     <w:p>
@@ -271,7 +283,7 @@
         <w:rPr>
           <w:b w:val="0"/>
         </w:rPr>
-        <w:t>1.2.2.1. Điều kiện tiếp cận thị trường và tỷ lệ sở hữu</w:t>
+        <w:t>1.2.3.1. Điều kiện tiếp cận thị trường và tỷ lệ sở hữu</w:t>
       </w:r>
     </w:p>
     <w:p>
@@ -283,7 +295,19 @@
         <w:rPr>
           <w:b w:val="0"/>
         </w:rPr>
-        <w:t>1.2.2.2. Điều kiện bảo đảm quốc phòng, an ninh</w:t>
+        <w:t>1.2.3.2. Điều kiện bảo đảm quốc phòng, an ninh</w:t>
+      </w:r>
+    </w:p>
+    <w:p>
+      <w:pPr>
+        <w:spacing w:after="60" w:line="312" w:lineRule="auto"/>
+        <w:ind w:left="1276"/>
+      </w:pPr>
+      <w:r>
+        <w:rPr>
+          <w:b w:val="0"/>
+        </w:rPr>
+        <w:t>1.2.3.3. Điều kiện của ngành, nghề đầu tư kinh doanh có điều kiện</w:t>
       </w:r>
     </w:p>
     <w:p>
@@ -295,7 +319,7 @@
         <w:rPr>
           <w:b w:val="0"/>
         </w:rPr>
-        <w:t>1.2.3. Trình tự, thủ tục mua cổ phần, phần vốn góp</w:t>
+        <w:t>1.2.4. Trình tự, thủ tục</w:t>
       </w:r>
     </w:p>
     <w:p>
@@ -307,7 +331,7 @@
         <w:rPr>
           <w:b w:val="0"/>
         </w:rPr>
-        <w:t>1.2.3.1. Đăng ký mua cổ phần, phần vốn góp tại cơ quan đăng ký đầu tư</w:t>
+        <w:t>1.2.4.1. Các trường hợp phải đăng ký mua cổ phần, phần vốn góp</w:t>
       </w:r>
     </w:p>
     <w:p>
@@ -319,7 +343,7 @@
         <w:rPr>
           <w:b w:val="0"/>
         </w:rPr>
-        <w:t>1.2.3.2. Thay đổi thành viên, cổ đông tại cơ quan đăng ký kinh doanh</w:t>
+        <w:t>1.2.4.2. Hồ sơ, trình tự đăng ký tại cơ quan đăng ký đầu tư</w:t>
       </w:r>
     </w:p>
     <w:p>
@@ -331,7 +355,19 @@
         <w:rPr>
           <w:b w:val="0"/>
         </w:rPr>
-        <w:t>1.2.3.3. Chuyển vốn qua tài khoản vốn đầu tư trực tiếp</w:t>
+        <w:t>1.2.4.3. Đăng ký thay đổi thành viên, cổ đông tại cơ quan đăng ký kinh doanh</w:t>
+      </w:r>
+    </w:p>
+    <w:p>
+      <w:pPr>
+        <w:spacing w:after="60" w:line="312" w:lineRule="auto"/>
+        <w:ind w:left="1276"/>
+      </w:pPr>
+      <w:r>
+        <w:rPr>
+          <w:b w:val="0"/>
+        </w:rPr>
+        <w:t>1.2.4.4. Chuyển vốn qua tài khoản vốn đầu tư trực tiếp</w:t>
       </w:r>
     </w:p>
     <w:p>
@@ -343,7 +379,7 @@
         <w:rPr>
           <w:b w:val="0"/>
         </w:rPr>
-        <w:t>1.2.4. Trách nhiệm của cơ quan nhà nước, doanh nghiệp và nhà đầu tư</w:t>
+        <w:t>1.2.5. Trách nhiệm của cơ quan nhà nước, doanh nghiệp và nhà đầu tư nước ngoài</w:t>
       </w:r>
     </w:p>
     <w:p>
@@ -377,7 +413,7 @@
         <w:rPr>
           <w:b/>
         </w:rPr>
-        <w:t>2.1. Tình hình mua cổ phần, phần vốn góp của nhà đầu tư nước ngoài giai đoạn 2021 đến nay</w:t>
+        <w:t>2.1. Tình hình mua cổ phần, phần vốn góp của nhà đầu tư nước ngoài từ năm 2021 đến nay</w:t>
       </w:r>
     </w:p>
     <w:p>
@@ -389,7 +425,7 @@
         <w:rPr>
           <w:b w:val="0"/>
         </w:rPr>
-        <w:t>2.1.1. Quy mô, cơ cấu theo ngành và theo đối tác đầu tư</w:t>
+        <w:t>2.1.1. Quy mô và cơ cấu theo ngành, theo đối tác đầu tư</w:t>
       </w:r>
     </w:p>
     <w:p>
@@ -401,7 +437,7 @@
         <w:rPr>
           <w:b w:val="0"/>
         </w:rPr>
-        <w:t>2.1.2. Kết quả đạt được trong thực hiện pháp luật</w:t>
+        <w:t>2.1.2. Kết quả thực hiện pháp luật</w:t>
       </w:r>
     </w:p>
     <w:p>
@@ -412,7 +448,7 @@
         <w:rPr>
           <w:b/>
         </w:rPr>
-        <w:t>2.2. Một số vụ việc điển hình</w:t>
+        <w:t>2.2. Vụ việc điển hình</w:t>
       </w:r>
     </w:p>
     <w:p>
@@ -424,7 +460,7 @@
         <w:rPr>
           <w:b w:val="0"/>
         </w:rPr>
-        <w:t>2.2.1. Vụ việc mua cổ phần trong công ty cổ phần</w:t>
+        <w:t>2.2.1. Mua cổ phần trong công ty cổ phần</w:t>
       </w:r>
     </w:p>
     <w:p>
@@ -436,7 +472,7 @@
         <w:rPr>
           <w:b w:val="0"/>
         </w:rPr>
-        <w:t>2.2.2. Vụ việc mua phần vốn góp trong công ty trách nhiệm hữu hạn</w:t>
+        <w:t>2.2.2. Mua phần vốn góp trong công ty trách nhiệm hữu hạn</w:t>
       </w:r>
     </w:p>
     <w:p>
@@ -447,7 +483,7 @@
         <w:rPr>
           <w:b/>
         </w:rPr>
-        <w:t>2.3. Đánh giá quy định pháp luật hiện hành</w:t>
+        <w:t>2.3. Đánh giá pháp luật hiện hành</w:t>
       </w:r>
     </w:p>
     <w:p>
@@ -459,7 +495,7 @@
         <w:rPr>
           <w:b w:val="0"/>
         </w:rPr>
-        <w:t>2.3.1. Những quy định phù hợp</w:t>
+        <w:t>2.3.1. Những quy định phù hợp với thực tiễn</w:t>
       </w:r>
     </w:p>
     <w:p>
@@ -483,7 +519,7 @@
         <w:rPr>
           <w:b w:val="0"/>
         </w:rPr>
-        <w:t>2.3.3. Nguyên nhân</w:t>
+        <w:t>2.3.3. Nguyên nhân của hạn chế</w:t>
       </w:r>
     </w:p>
     <w:p>
@@ -506,7 +542,7 @@
         <w:rPr>
           <w:b/>
         </w:rPr>
-        <w:t>CHƯƠNG 3. KIẾN NGHỊ HOÀN THIỆN PHÁP LUẬT VÀ NÂNG CAO HIỆU QUẢ THỰC HIỆN PHÁP LUẬT VỀ MUA CỔ PHẦN, PHẦN VỐN GÓP CỦA NHÀ ĐẦU TƯ NƯỚC NGOÀI</w:t>
+        <w:t>CHƯƠNG 3. KIẾN NGHỊ HOÀN THIỆN PHÁP LUẬT VÀ GIẢI PHÁP BẢO ĐẢM THỰC HIỆN PHÁP LUẬT VỀ MUA CỔ PHẦN, PHẦN VỐN GÓP CỦA NHÀ ĐẦU TƯ NƯỚC NGOÀI</w:t>
       </w:r>
     </w:p>
     <w:p>
@@ -529,7 +565,7 @@
         <w:rPr>
           <w:b w:val="0"/>
         </w:rPr>
-        <w:t>3.1.1. Về điều kiện tiếp cận thị trường đối với nhà đầu tư nước ngoài</w:t>
+        <w:t>3.1.1. Về điều kiện tiếp cận thị trường</w:t>
       </w:r>
     </w:p>
     <w:p>
@@ -541,7 +577,7 @@
         <w:rPr>
           <w:b w:val="0"/>
         </w:rPr>
-        <w:t>3.1.2. Về thủ tục đăng ký mua cổ phần, phần vốn góp</w:t>
+        <w:t>3.1.2. Về các trường hợp phải đăng ký và hồ sơ đăng ký</w:t>
       </w:r>
     </w:p>
     <w:p>
@@ -564,7 +600,7 @@
         <w:rPr>
           <w:b/>
         </w:rPr>
-        <w:t>3.2. Giải pháp nâng cao hiệu quả thực hiện pháp luật</w:t>
+        <w:t>3.2. Giải pháp bảo đảm thực hiện pháp luật</w:t>
       </w:r>
     </w:p>
     <w:p>
@@ -576,7 +612,7 @@
         <w:rPr>
           <w:b w:val="0"/>
         </w:rPr>
-        <w:t>3.2.1. Đối với cơ quan nhà nước</w:t>
+        <w:t>3.2.1. Đối với cơ quan đăng ký đầu tư và cơ quan đăng ký kinh doanh</w:t>
       </w:r>
     </w:p>
     <w:p>

</xml_diff>